<commit_message>
Reorder settings dimensions to User, Object, Section.
Keep the same field UUIDs. Align the TZ table, forms, and OpenSpec with the new order.

Co-authored-by: an_skripko <an_skripko@vk.com>
</commit_message>
<xml_diff>
--- a/ERP.2026.14 Заявка на доработку 1С ERP УХ (ред. 2)_1.docx
+++ b/ERP.2026.14 Заявка на доработку 1С ERP УХ (ред. 2)_1.docx
@@ -720,7 +720,7 @@
                 <w:sz w:val="20"/>
                 <w:szCs w:val="20"/>
               </w:rPr>
-              <w:t xml:space="preserve">ОбъектДатыЗапрета</w:t>
+              <w:t xml:space="preserve">Пользователь</w:t>
             </w:r>
           </w:p>
         </w:tc>
@@ -768,7 +768,7 @@
                 <w:sz w:val="20"/>
                 <w:szCs w:val="20"/>
               </w:rPr>
-              <w:t xml:space="preserve">Объект, по которому устанавливается граница: организация, касса, склад, банковский счёт, сценарий бюджетирования, сценарий товарного планирования (закрытый перечень — таблица в 2.1.2). Тип соответствует измерению «Объект» типового регистра. Пустое значение означает общую дату по разделу — для всех объектов раздела, у которых нет собственной записи (см. 2.1.2).</w:t>
+              <w:t xml:space="preserve">Пользователь или группа пользователей. Тип соответствует измерению «Пользователь» типового регистра. Пустое значение означает «для всех пользователей».</w:t>
             </w:r>
           </w:p>
         </w:tc>
@@ -797,7 +797,7 @@
                 <w:sz w:val="20"/>
                 <w:szCs w:val="20"/>
               </w:rPr>
-              <w:t xml:space="preserve">Пользователь</w:t>
+              <w:t xml:space="preserve">ОбъектДатыЗапрета</w:t>
             </w:r>
           </w:p>
         </w:tc>
@@ -845,7 +845,7 @@
                 <w:sz w:val="20"/>
                 <w:szCs w:val="20"/>
               </w:rPr>
-              <w:t xml:space="preserve">Пользователь или группа пользователей. Тип соответствует измерению «Пользователь» типового регистра. Пустое значение означает «для всех пользователей».</w:t>
+              <w:t xml:space="preserve">Объект, по которому устанавливается граница: организация, касса, склад, банковский счёт, сценарий бюджетирования, сценарий товарного планирования (закрытый перечень — таблица в 2.1.2). Тип соответствует измерению «Объект» типового регистра. Пустое значение означает общую дату по разделу — для всех объектов раздела, у которых нет собственной записи (см. 2.1.2).</w:t>
             </w:r>
           </w:p>
         </w:tc>
@@ -3948,7 +3948,7 @@
                 <w:sz w:val="20"/>
                 <w:szCs w:val="20"/>
               </w:rPr>
-              <w:t xml:space="preserve">ОбъектДатыЗапрета, Пользователь, РазделДатыЗапрета (измерения)</w:t>
+              <w:t xml:space="preserve">Пользователь, ОбъектДатыЗапрета, РазделДатыЗапрета (измерения)</w:t>
             </w:r>
           </w:p>
         </w:tc>

</xml_diff>

<commit_message>
Actualize automatic prohibition dates; leave manual records.
Nightly job rewrites and deletes nп_авто rows to match enabled settings, and does not change typical-form entries.

Co-authored-by: an_skripko <an_skripko@vk.com>
</commit_message>
<xml_diff>
--- a/ERP.2026.14 Заявка на доработку 1С ERP УХ (ред. 2)_1.docx
+++ b/ERP.2026.14 Заявка на доработку 1С ERP УХ (ред. 2)_1.docx
@@ -2854,7 +2854,7 @@
         <w:spacing w:after="120" w:line="276"/>
       </w:pPr>
       <w:r>
-        <w:t xml:space="preserve">Изменяются только те комбинации «организация — пользователь — раздел», которые присутствуют в регистре настроек с признаком «Включено». Даты, заданные только в типовой форме, не перезаписываются.</w:t>
+        <w:t xml:space="preserve">Ручные записи типового регистра (комментарий не начинается с «нп_авто» и не с «нп_открытие») задание не изменяет и не удаляет. Автоматические записи (комментарий «нп_авто» или «нп_авто|NNNNN») актуализируются по текущим включённым настройкам: дата пересчитывается, комбинации, которых больше нет во включённых настройках, удаляются. Записи открытого периода (комментарий «нп_открытие») до истечения срока K не перезаписываются автоустановкой. Параллельно вести ту же политику в типовой форме не следует: ручная запись по той же комбинации останется и по правилам БСП может перекрыть автоустановку, а задание её не исправит. Типовую форму используют только для исключений, которые нельзя выразить настройкой.</w:t>
       </w:r>
     </w:p>
     <w:p>
@@ -2902,7 +2902,7 @@
         <w:spacing w:after="120" w:line="276"/>
       </w:pPr>
       <w:r>
-        <w:t xml:space="preserve">При снятии признака «Включено» или удалении записи настройки регламентное задание перестаёт обновлять соответствующую запись типового регистра. Ранее записанная дата остаётся без изменений и далее управляется вручную в типовой форме. Автоматическое удаление записи из типового регистра не выполняется.</w:t>
+        <w:t xml:space="preserve">При снятии признака «Включено» или удалении записи настройки регламентное задание при ближайшем успешном запуске удаляет соответствующие автоматические записи из типового регистра. Ручные записи не затрагиваются. Если настройку изменили так, что разворачивание даёт другой набор комбинаций (например, убрали организацию — вместо 18 записей по разделам остаётся общая дата адресата), устаревшие автозаписи удаляются, актуальные перезаписываются.</w:t>
       </w:r>
     </w:p>
     <w:p>
@@ -5697,7 +5697,7 @@
                 <w:sz w:val="20"/>
                 <w:szCs w:val="20"/>
               </w:rPr>
-              <w:t xml:space="preserve">Дата в типовом регистре не изменяется при последующих запусках; запись не удаляется</w:t>
+              <w:t xml:space="preserve">Автозапись этой настройки удалена из типового регистра; ручные записи не изменены</w:t>
             </w:r>
           </w:p>
         </w:tc>

</xml_diff>

<commit_message>
Remove italic notes from the ERP.2026.14 request.
Drop the four italic helper paragraphs from the Word request and the TZ extract; they were template remarks, not requirements.

Co-authored-by: an_skripko <an_skripko@vk.com>
</commit_message>
<xml_diff>
--- a/ERP.2026.14 Заявка на доработку 1С ERP УХ (ред. 2)_1.docx
+++ b/ERP.2026.14 Заявка на доработку 1С ERP УХ (ред. 2)_1.docx
@@ -15,22 +15,6 @@
           <w:szCs w:val="30"/>
         </w:rPr>
         <w:t xml:space="preserve">ЗАЯВКА НА ДОРАБОТКУ В 1С:ERP.УХ</w:t>
-      </w:r>
-    </w:p>
-    <w:p>
-      <w:pPr>
-        <w:spacing w:after="260"/>
-        <w:jc w:val="center"/>
-      </w:pPr>
-      <w:r>
-        <w:rPr>
-          <w:i/>
-          <w:iCs/>
-          <w:color w:val="595959"/>
-          <w:sz w:val="20"/>
-          <w:szCs w:val="20"/>
-        </w:rPr>
-        <w:t xml:space="preserve">Редакция 2 от 20.08.2026 (уточнены алгоритмы, добавлены критерии приёмки)</w:t>
       </w:r>
     </w:p>
     <w:p>
@@ -137,20 +121,6 @@
           <w:szCs w:val="24"/>
         </w:rPr>
         <w:t xml:space="preserve">Исходные данные среды</w:t>
-      </w:r>
-    </w:p>
-    <w:p>
-      <w:pPr>
-        <w:spacing w:after="120" w:line="276"/>
-      </w:pPr>
-      <w:r>
-        <w:rPr>
-          <w:i/>
-          <w:iCs/>
-          <w:sz w:val="20"/>
-          <w:szCs w:val="20"/>
-        </w:rPr>
-        <w:t xml:space="preserve">Заполняется инициатором совместно с администратором ИБ. Обязательно для оценки: механизм дат запрета и бесшовная интеграция различаются между релизами.</w:t>
       </w:r>
     </w:p>
     <w:tbl>
@@ -4986,20 +4956,6 @@
     </w:p>
     <w:p>
       <w:pPr>
-        <w:spacing w:after="120" w:line="276"/>
-      </w:pPr>
-      <w:r>
-        <w:rPr>
-          <w:i/>
-          <w:iCs/>
-          <w:sz w:val="20"/>
-          <w:szCs w:val="20"/>
-        </w:rPr>
-        <w:t xml:space="preserve">Приведённый ниже состав объектов является предложением инициатора и может быть скорректирован подрядчиком при сохранении требований раздела 2.</w:t>
-      </w:r>
-    </w:p>
-    <w:p>
-      <w:pPr>
         <w:pStyle w:val="ListParagraph"/>
         <w:numPr>
           <w:ilvl w:val="0"/>
@@ -7759,20 +7715,6 @@
       </w:pPr>
       <w:r>
         <w:t xml:space="preserve"/>
-      </w:r>
-    </w:p>
-    <w:p>
-      <w:pPr>
-        <w:spacing w:after="120" w:line="276"/>
-      </w:pPr>
-      <w:r>
-        <w:rPr>
-          <w:i/>
-          <w:iCs/>
-          <w:sz w:val="20"/>
-          <w:szCs w:val="20"/>
-        </w:rPr>
-        <w:t xml:space="preserve">Подробные алгоритмы и структура метаданных детализируются в техническом задании к заявке ERP.2026.14. При расхождении верны требования настоящей заявки, если техническим заданием не зафиксировано иное с отметкой о согласовании инициатором.</w:t>
       </w:r>
     </w:p>
     <w:sectPr>

</xml_diff>

<commit_message>
Sync the ERP.2026.14 request with current decisions.
Update the Word assignment and tz-extract: basic rights role, early
close for all request users, report for full rights only, 18 org
sections, calculation methods, and request header organization.

Co-authored-by: an_skripko <an_skripko@vk.com>
</commit_message>
<xml_diff>
--- a/ERP.2026.14 Заявка на доработку 1С ERP УХ (ред. 2)_1.docx
+++ b/ERP.2026.14 Заявка на доработку 1С ERP УХ (ред. 2)_1.docx
@@ -26,11 +26,9 @@
           <w:b/>
           <w:bCs/>
         </w:rPr>
-        <w:t xml:space="preserve">Номер заявки: </w:t>
-      </w:r>
-      <w:r>
-        <w:t xml:space="preserve">ERP.2026.14</w:t>
-      </w:r>
+        <w:t>Номер заявки: ERP.2026.14 (редакция 2 от 20.08.2026; актуализировано 06.09.2026 по решениям реализации)</w:t>
+      </w:r>
+      <w:r/>
     </w:p>
     <w:p>
       <w:pPr>
@@ -486,7 +484,7 @@
         <w:spacing w:after="60" w:line="276"/>
       </w:pPr>
       <w:r>
-        <w:t xml:space="preserve">автоматическую установку абсолютной даты запрета по правилу «текущая дата минус N дней»;</w:t>
+        <w:t>автоматическую установку даты запрета: скользящее окно «текущая дата минус N дней», типовое относительное описание БСП и комбинированное правило;</w:t>
       </w:r>
     </w:p>
     <w:p>
@@ -607,7 +605,7 @@
                 <w:sz w:val="20"/>
                 <w:szCs w:val="20"/>
               </w:rPr>
-              <w:t xml:space="preserve">Поле</w:t>
+              <w:t>Поле</w:t>
             </w:r>
           </w:p>
         </w:tc>
@@ -634,7 +632,7 @@
                 <w:sz w:val="20"/>
                 <w:szCs w:val="20"/>
               </w:rPr>
-              <w:t xml:space="preserve">Вид</w:t>
+              <w:t>Вид</w:t>
             </w:r>
           </w:p>
         </w:tc>
@@ -661,7 +659,7 @@
                 <w:sz w:val="20"/>
                 <w:szCs w:val="20"/>
               </w:rPr>
-              <w:t xml:space="preserve">Описание</w:t>
+              <w:t>Описание</w:t>
             </w:r>
           </w:p>
         </w:tc>
@@ -690,7 +688,7 @@
                 <w:sz w:val="20"/>
                 <w:szCs w:val="20"/>
               </w:rPr>
-              <w:t xml:space="preserve">Пользователь</w:t>
+              <w:t>Пользователь</w:t>
             </w:r>
           </w:p>
         </w:tc>
@@ -714,7 +712,7 @@
                 <w:sz w:val="20"/>
                 <w:szCs w:val="20"/>
               </w:rPr>
-              <w:t xml:space="preserve">Измерение</w:t>
+              <w:t>Измерение</w:t>
             </w:r>
           </w:p>
         </w:tc>
@@ -738,7 +736,7 @@
                 <w:sz w:val="20"/>
                 <w:szCs w:val="20"/>
               </w:rPr>
-              <w:t xml:space="preserve">Пользователь или группа пользователей. Тип соответствует измерению «Пользователь» типового регистра. Пустое значение означает «для всех пользователей».</w:t>
+              <w:t>Пользователь или группа пользователей. Тип соответствует измерению «Пользователь» типового регистра. Пустое значение означает «для всех пользователей» (ДляВсехПользователей). Группа «Все пользователи» — другой адресат.</w:t>
             </w:r>
           </w:p>
         </w:tc>
@@ -767,7 +765,7 @@
                 <w:sz w:val="20"/>
                 <w:szCs w:val="20"/>
               </w:rPr>
-              <w:t xml:space="preserve">ОбъектДатыЗапрета</w:t>
+              <w:t>РазделДатыЗапрета</w:t>
             </w:r>
           </w:p>
         </w:tc>
@@ -791,7 +789,7 @@
                 <w:sz w:val="20"/>
                 <w:szCs w:val="20"/>
               </w:rPr>
-              <w:t xml:space="preserve">Измерение</w:t>
+              <w:t>Измерение</w:t>
             </w:r>
           </w:p>
         </w:tc>
@@ -815,7 +813,7 @@
                 <w:sz w:val="20"/>
                 <w:szCs w:val="20"/>
               </w:rPr>
-              <w:t xml:space="preserve">Объект, по которому устанавливается граница: организация, касса, склад, банковский счёт, сценарий бюджетирования, сценарий товарного планирования (закрытый перечень — таблица в 2.1.2). Тип соответствует измерению «Объект» типового регистра. Пустое значение означает общую дату по разделу — для всех объектов раздела, у которых нет собственной записи (см. 2.1.2).</w:t>
+              <w:t>Раздел даты запрета. Пустое вместе с организацией — 18 организационных разделов. Пустое вместе с пустым объектом — общая дата адресата. Касса, склад, счёт или сценарий без раздела недопустимы.</w:t>
             </w:r>
           </w:p>
         </w:tc>
@@ -844,7 +842,7 @@
                 <w:sz w:val="20"/>
                 <w:szCs w:val="20"/>
               </w:rPr>
-              <w:t xml:space="preserve">РазделДатыЗапрета</w:t>
+              <w:t>ОбъектДатыЗапрета</w:t>
             </w:r>
           </w:p>
         </w:tc>
@@ -868,7 +866,7 @@
                 <w:sz w:val="20"/>
                 <w:szCs w:val="20"/>
               </w:rPr>
-              <w:t xml:space="preserve">Измерение</w:t>
+              <w:t>Измерение</w:t>
             </w:r>
           </w:p>
         </w:tc>
@@ -892,7 +890,7 @@
                 <w:sz w:val="20"/>
                 <w:szCs w:val="20"/>
               </w:rPr>
-              <w:t xml:space="preserve">Раздел даты запрета. Пустое значение означает «все разделы, для которых допустим тип указанного объекта» (см. 2.1.2). Наименование поля привести к типовой терминологии БСП.</w:t>
+              <w:t>Организация, касса, склад, банковский счёт, сценарий бюджетирования, сценарий товарного планирования. На форме организация задаётся отдельным полем и пишется в это измерение. Пустой объект при заполненном разделе — общая дата раздела (Объект = Раздел).</w:t>
             </w:r>
           </w:p>
         </w:tc>
@@ -921,7 +919,7 @@
                 <w:sz w:val="20"/>
                 <w:szCs w:val="20"/>
               </w:rPr>
-              <w:t xml:space="preserve">ЧислоДней (N)</w:t>
+              <w:t>СпособРасчета</w:t>
             </w:r>
           </w:p>
         </w:tc>
@@ -945,7 +943,7 @@
                 <w:sz w:val="20"/>
                 <w:szCs w:val="20"/>
               </w:rPr>
-              <w:t xml:space="preserve">Ресурс</w:t>
+              <w:t>Ресурс</w:t>
             </w:r>
           </w:p>
         </w:tc>
@@ -969,7 +967,7 @@
                 <w:sz w:val="20"/>
                 <w:szCs w:val="20"/>
               </w:rPr>
-              <w:t xml:space="preserve">Количество последних дней, доступных для редактирования. Целое неотрицательное число, включая 0. Верхняя граница не устанавливается.</w:t>
+              <w:t>Скользящее окно / относительная дата БСП / комбинированная.</w:t>
             </w:r>
           </w:p>
         </w:tc>
@@ -998,7 +996,7 @@
                 <w:sz w:val="20"/>
                 <w:szCs w:val="20"/>
               </w:rPr>
-              <w:t xml:space="preserve">Включено</w:t>
+              <w:t>ЧислоДней (N)</w:t>
             </w:r>
           </w:p>
         </w:tc>
@@ -1022,7 +1020,7 @@
                 <w:sz w:val="20"/>
                 <w:szCs w:val="20"/>
               </w:rPr>
-              <w:t xml:space="preserve">Ресурс</w:t>
+              <w:t>Ресурс</w:t>
             </w:r>
           </w:p>
         </w:tc>
@@ -1046,7 +1044,135 @@
                 <w:sz w:val="20"/>
                 <w:szCs w:val="20"/>
               </w:rPr>
-              <w:t xml:space="preserve">Признак применения настройки регламентным заданием.</w:t>
+              <w:t>Количество последних дней, доступных для редактирования. Для скользящего и комбинированного способа. Целое неотрицательное число, включая 0.</w:t>
+            </w:r>
+          </w:p>
+        </w:tc>
+      </w:tr>
+      <w:tr>
+        <w:tc>
+          <w:tcPr>
+            <w:tcW w:type="dxa" w:w="2600"/>
+          </w:tcPr>
+          <w:p>
+            <w:r>
+              <w:t>ОписаниеДатыЗапрета</w:t>
+            </w:r>
+          </w:p>
+        </w:tc>
+        <w:tc>
+          <w:tcPr>
+            <w:tcW w:type="dxa" w:w="2200"/>
+          </w:tcPr>
+          <w:p>
+            <w:r>
+              <w:t>Ресурс</w:t>
+            </w:r>
+          </w:p>
+        </w:tc>
+        <w:tc>
+          <w:tcPr>
+            <w:tcW w:type="dxa" w:w="4555"/>
+          </w:tcPr>
+          <w:p>
+            <w:r>
+              <w:t>Типовое описание относительной даты БСП. Для относительного и комбинированного способа.</w:t>
+            </w:r>
+          </w:p>
+        </w:tc>
+      </w:tr>
+      <w:tr>
+        <w:tc>
+          <w:tcPr>
+            <w:tcW w:type="dxa" w:w="2600"/>
+          </w:tcPr>
+          <w:p>
+            <w:r>
+              <w:t>КоличествоДнейРазрешения</w:t>
+            </w:r>
+          </w:p>
+        </w:tc>
+        <w:tc>
+          <w:tcPr>
+            <w:tcW w:type="dxa" w:w="2200"/>
+          </w:tcPr>
+          <w:p>
+            <w:r>
+              <w:t>Ресурс</w:t>
+            </w:r>
+          </w:p>
+        </w:tc>
+        <w:tc>
+          <w:tcPr>
+            <w:tcW w:type="dxa" w:w="4555"/>
+          </w:tcPr>
+          <w:p>
+            <w:r>
+              <w:t>Дни разрешения относительного или комбинированного правила БСП.</w:t>
+            </w:r>
+          </w:p>
+        </w:tc>
+      </w:tr>
+      <w:tr>
+        <w:tc>
+          <w:tcPr>
+            <w:tcW w:type="dxa" w:w="2600"/>
+          </w:tcPr>
+          <w:p>
+            <w:r>
+              <w:t>ВсеРазделыБезОрганизации</w:t>
+            </w:r>
+          </w:p>
+        </w:tc>
+        <w:tc>
+          <w:tcPr>
+            <w:tcW w:type="dxa" w:w="2200"/>
+          </w:tcPr>
+          <w:p>
+            <w:r>
+              <w:t>Ресурс</w:t>
+            </w:r>
+          </w:p>
+        </w:tc>
+        <w:tc>
+          <w:tcPr>
+            <w:tcW w:type="dxa" w:w="4555"/>
+          </w:tcPr>
+          <w:p>
+            <w:r>
+              <w:t>Флажок «Разделы без организации»: пять общих дат Банк / Касса / СкладскиеОперации / Бюджетирование / Планирование (Объект = Раздел).</w:t>
+            </w:r>
+          </w:p>
+        </w:tc>
+      </w:tr>
+      <w:tr>
+        <w:tc>
+          <w:tcPr>
+            <w:tcW w:type="dxa" w:w="2600"/>
+          </w:tcPr>
+          <w:p>
+            <w:r>
+              <w:t>Включено</w:t>
+            </w:r>
+          </w:p>
+        </w:tc>
+        <w:tc>
+          <w:tcPr>
+            <w:tcW w:type="dxa" w:w="2200"/>
+          </w:tcPr>
+          <w:p>
+            <w:r>
+              <w:t>Ресурс</w:t>
+            </w:r>
+          </w:p>
+        </w:tc>
+        <w:tc>
+          <w:tcPr>
+            <w:tcW w:type="dxa" w:w="4555"/>
+          </w:tcPr>
+          <w:p>
+            <w:r>
+              <w:t>Признак применения настройки регламентным заданием.</w:t>
             </w:r>
           </w:p>
         </w:tc>
@@ -1057,7 +1183,7 @@
         <w:spacing w:after="120" w:line="276"/>
       </w:pPr>
       <w:r>
-        <w:t xml:space="preserve">Для одного объекта допускается несколько настроек с разным N: по пользователям или группам пользователей и, при необходимости, по разделам.</w:t>
+        <w:t>Для одного адресата допускается несколько настроек с разным N и способом расчёта: по пользователям или группам, по организации, по разделу и по флажку «Разделы без организации».</w:t>
       </w:r>
     </w:p>
     <w:p>
@@ -1065,7 +1191,7 @@
         <w:spacing w:after="120" w:line="276"/>
       </w:pPr>
       <w:r>
-        <w:t xml:space="preserve">Регистр ведёт пользователь с полными правами. Отдельные роли для настроек не создаются. Роль нп_БазовыеПрава даёт доступ только к объектам, необходимым для работы с заявкой на открытие периода; ни чтение, ни запись регистра настроек в неё не входят. Пользователь узнаёт, что период закрыт, из типового сообщения об ошибке при записи и из пояснения на форме заявки (2.2.7), а не из регистра настроек.</w:t>
+        <w:t>Регистр ведёт пользователь с полными правами. Отдельная роль для настроек не создаётся. Роль нп_БазовыеПраваДатЗапрета (пока расширение отдельно от НП; после переноса права влить в нп_БазовыеПрава) даёт доступ к заявке: создание, заполнение, отправка в ДО и команда «Закрыть период досрочно». У регистра состояния — только чтение (форма заявки), без просмотра списка. Ни чтение, ни запись регистра настроек, константы уведомлений и отчёта в неё не входят. Пользователь узнаёт, что период закрыт, из типового сообщения об ошибке при записи и из пояснения на форме заявки (2.2.7), а не из регистра настроек.</w:t>
       </w:r>
     </w:p>
     <w:p>
@@ -1243,7 +1369,7 @@
                 <w:sz w:val="20"/>
                 <w:szCs w:val="20"/>
               </w:rPr>
-              <w:t xml:space="preserve">Авансовые отчёты, Бухгалтерский учёт, Ввод остатков, Внеоборотные активы, Внутреннее товародвижение, Закупки, Международный учёт, Продажи, Продажи между организациями, Производство, Регламентные операции, Розничные продажи, Сверки и корректировки задолженности, Финансовый контур, Ретро-бонусы клиентов, Ретро-бонусы поставщиков, Управление ремонтами</w:t>
+              <w:t>Авансовые отчёты, Бухгалтерский учёт, Ввод остатков, Внеоборотные активы, Внутреннее товародвижение, Закупки, Международный учёт, Продажи, Продажи между организациями, Производство, Регламентные операции, Розничные продажи, Сверки и корректировки задолженности, Финансовый контур, Ретро-бонусы клиентов, Ретро-бонусы поставщиков, Управление ремонтами, Учёт по МСФО</w:t>
             </w:r>
           </w:p>
         </w:tc>
@@ -1267,7 +1393,7 @@
                 <w:sz w:val="20"/>
                 <w:szCs w:val="20"/>
               </w:rPr>
-              <w:t xml:space="preserve">17</w:t>
+              <w:t>18</w:t>
             </w:r>
           </w:p>
         </w:tc>
@@ -1663,7 +1789,7 @@
         <w:spacing w:after="120" w:line="276"/>
       </w:pPr>
       <w:r>
-        <w:t xml:space="preserve">Пустые объект и раздел вместе означают общую дату «на все случаи» — но только для своего пользователя или группы (приложение 1, разделы 3.3 и 4.1). Настройки по конкретным объектам для того же пользователя ей не мешают: общая дата применяется, только если для проверяемых данных не нашлось более точной записи.</w:t>
+        <w:t>Пустые объект и раздел вместе — общая дата адресата: одна запись типового регистра на все разделы и объекты, но только для своего пользователя, группы или «для всех». Организация без раздела — 18 организационных разделов этой организации (включая УчетПоМСФО), без банка, кассы, склада и сценариев; пустая пара раздел+объект при этом не создаётся. Флажок «Разделы без организации» — пять общих дат Банк / Касса / СкладскиеОперации / Бюджетирование / Планирование (Объект = Раздел). Без раздела объект может быть только организацией. Банк, касса, склад или сценарий без объекта пишутся как общая дата раздела (Объект = Раздел).</w:t>
       </w:r>
     </w:p>
     <w:p>
@@ -1718,7 +1844,7 @@
                 <w:sz w:val="20"/>
                 <w:szCs w:val="20"/>
               </w:rPr>
-              <w:t xml:space="preserve">Объект</w:t>
+              <w:t>Объект</w:t>
             </w:r>
           </w:p>
         </w:tc>
@@ -1745,7 +1871,7 @@
                 <w:sz w:val="20"/>
                 <w:szCs w:val="20"/>
               </w:rPr>
-              <w:t xml:space="preserve">Раздел</w:t>
+              <w:t>Раздел</w:t>
             </w:r>
           </w:p>
         </w:tc>
@@ -1772,7 +1898,7 @@
                 <w:sz w:val="20"/>
                 <w:szCs w:val="20"/>
               </w:rPr>
-              <w:t xml:space="preserve">Как применяется</w:t>
+              <w:t>Как применяется</w:t>
             </w:r>
           </w:p>
         </w:tc>
@@ -1801,7 +1927,7 @@
                 <w:sz w:val="20"/>
                 <w:szCs w:val="20"/>
               </w:rPr>
-              <w:t xml:space="preserve">Заполнен</w:t>
+              <w:t>Заполнен (организация + раздел)</w:t>
             </w:r>
           </w:p>
         </w:tc>
@@ -1825,7 +1951,7 @@
                 <w:sz w:val="20"/>
                 <w:szCs w:val="20"/>
               </w:rPr>
-              <w:t xml:space="preserve">Заполнен</w:t>
+              <w:t>Заполнен</w:t>
             </w:r>
           </w:p>
         </w:tc>
@@ -1849,7 +1975,7 @@
                 <w:sz w:val="20"/>
                 <w:szCs w:val="20"/>
               </w:rPr>
-              <w:t xml:space="preserve">Одна запись типового регистра по указанным объекту и разделу.</w:t>
+              <w:t>Одна запись типового регистра: этот организационный раздел и эта организация.</w:t>
             </w:r>
           </w:p>
         </w:tc>
@@ -1878,7 +2004,7 @@
                 <w:sz w:val="20"/>
                 <w:szCs w:val="20"/>
               </w:rPr>
-              <w:t xml:space="preserve">Заполнен</w:t>
+              <w:t>Заполнен (организация)</w:t>
             </w:r>
           </w:p>
         </w:tc>
@@ -1902,7 +2028,7 @@
                 <w:sz w:val="20"/>
                 <w:szCs w:val="20"/>
               </w:rPr>
-              <w:t xml:space="preserve">Не заполнен</w:t>
+              <w:t>Не заполнен</w:t>
             </w:r>
           </w:p>
         </w:tc>
@@ -1926,7 +2052,7 @@
                 <w:sz w:val="20"/>
                 <w:szCs w:val="20"/>
               </w:rPr>
-              <w:t xml:space="preserve">Настройка разворачивается в отдельные записи по каждому разделу, для которого допустим тип указанного объекта (см. пояснение ниже).</w:t>
+              <w:t>18 организационных разделов этой организации, включая УчетПоМСФО. Банк, касса, склад и сценарии не входят. Пустая пара раздел+объект не создаётся.</w:t>
             </w:r>
           </w:p>
         </w:tc>
@@ -1955,7 +2081,7 @@
                 <w:sz w:val="20"/>
                 <w:szCs w:val="20"/>
               </w:rPr>
-              <w:t xml:space="preserve">Не заполнен</w:t>
+              <w:t>Не заполнен</w:t>
             </w:r>
           </w:p>
         </w:tc>
@@ -1979,7 +2105,7 @@
                 <w:sz w:val="20"/>
                 <w:szCs w:val="20"/>
               </w:rPr>
-              <w:t xml:space="preserve">Заполнен</w:t>
+              <w:t>Заполнен</w:t>
             </w:r>
           </w:p>
         </w:tc>
@@ -2003,7 +2129,7 @@
                 <w:sz w:val="20"/>
                 <w:szCs w:val="20"/>
               </w:rPr>
-              <w:t xml:space="preserve">Общая дата по разделу: одна запись с незаполненным объектом. Действует для всех объектов раздела, по которым нет более детальной записи.</w:t>
+              <w:t>Общая дата раздела: одна запись Объект = Раздел. Действует для всех объектов раздела, по которым нет более детальной записи.</w:t>
             </w:r>
           </w:p>
         </w:tc>
@@ -2032,7 +2158,7 @@
                 <w:sz w:val="20"/>
                 <w:szCs w:val="20"/>
               </w:rPr>
-              <w:t xml:space="preserve">Не заполнен</w:t>
+              <w:t>Не заполнен</w:t>
             </w:r>
           </w:p>
         </w:tc>
@@ -2056,7 +2182,7 @@
                 <w:sz w:val="20"/>
                 <w:szCs w:val="20"/>
               </w:rPr>
-              <w:t xml:space="preserve">Не заполнен</w:t>
+              <w:t>Не заполнен</w:t>
             </w:r>
           </w:p>
         </w:tc>
@@ -2080,7 +2206,7 @@
                 <w:sz w:val="20"/>
                 <w:szCs w:val="20"/>
               </w:rPr>
-              <w:t xml:space="preserve">Допускается: единая дата в рамках адресата (не всей базы). Приоритет — см. приложение 1, разделы 3.3 и 4.1.</w:t>
+              <w:t>Допускается: общая дата адресата (пустые раздел и объект). Не вся база, а свой пользователь / группа / «для всех».</w:t>
             </w:r>
           </w:p>
         </w:tc>
@@ -2091,7 +2217,7 @@
         <w:spacing w:after="120" w:line="276"/>
       </w:pPr>
       <w:r>
-        <w:t xml:space="preserve">Подтверждено анализом типового кода (функция ПоискДатыЗапрета/НайтиДатуЗапрета, приложение 1): запись типового регистра ищется по конкретному разделу проверяемых данных; если раздел не совпадает ни с одной записью, поиск сразу проваливается в запись «раздел не заполнен, объект не заполнен» — общую дату адресата, минуя любую попытку найти запись «этот объект в любом разделе». Поэтому настройка по объекту разворачивается в отдельные записи по каждому разделу, допускающему тип этого объекта, и появление новых разделов при обновлении конфигурации требует актуализации перечня.</w:t>
+        <w:t>Подтверждено анализом типового кода (функция ПоискДатыЗапрета/НайтиДатуЗапрета, приложение 1): запись типового регистра ищется по конкретному разделу проверяемых данных; если раздел не совпадает ни с одной записью, поиск сразу проваливается в запись «раздел не заполнен, объект не заполнен» — общую дату адресата, минуя любую попытку найти запись «этот объект в любом разделе». Поэтому организация без раздела разворачивается в 18 организационных разделов, а не в одну запись «организация в любом разделе». Появление новых разделов при обновлении конфигурации требует актуализации перечня.</w:t>
       </w:r>
     </w:p>
     <w:p>
@@ -2099,7 +2225,7 @@
         <w:spacing w:after="120" w:line="276"/>
       </w:pPr>
       <w:r>
-        <w:t xml:space="preserve">Разворачивание настройки по элементам справочника (по всем кассам, складам, счетам) не выполняется: перечень объектов меняется, а новые элементы иначе остались бы без границы. Требование «одно правило на все объекты раздела» реализуется записью с незаполненным объектом.</w:t>
+        <w:t>Разворачивание настройки по элементам справочника (по всем кассам, складам, счетам) не выполняется: перечень объектов меняется, а новые элементы иначе остались бы без границы. Требование «одно правило на все объекты раздела» реализуется записью Объект = Раздел. Форма настройки идёт каскадом от первого поля: сначала организация — в списке только организационные разделы; сначала Банк / касса / склад / сценарий — организация скрыта, появляется объект этого раздела.</w:t>
       </w:r>
     </w:p>
     <w:p>
@@ -2139,7 +2265,7 @@
         <w:spacing w:after="120" w:line="276"/>
       </w:pPr>
       <w:r>
-        <w:t xml:space="preserve">Регламентное задание нп_СдвигДатЗапретаИзменения записывает в типовой регистр ДатыЗапретаИзменения абсолютную дату, рассчитанную как конец дня даты «текущая дата сеанса минус N дней».</w:t>
+        <w:t>Способ расчёта настройки: скользящее окно, относительная дата БСП или комбинированная (одна абсолютная дата = максимум двух правил). Для скользящего и комбинированного регламентное задание нп_СдвигДатЗапретаИзменения записывает в типовой регистр абсолютную дату «текущая дата сеанса минус N дней». Относительная автозапись хранит типовое ОписаниеДатыЗапрета и дату-заглушку 39990202; БСП считает границу на лету. Относительные-только записи ночной пересчёт не переписывает.</w:t>
       </w:r>
     </w:p>
     <w:p>
@@ -2848,7 +2974,7 @@
         <w:spacing w:after="120" w:line="276"/>
       </w:pPr>
       <w:r>
-        <w:t xml:space="preserve">Если настройка задана по группе пользователей, в типовой регистр записывается одна запись с этой группой. Разворачивание группы в записи по каждому пользователю не выполняется. Приоритет при вхождении пользователя в несколько групп определяется полем «Комментарий» записи типового регистра по каждой группе (по убыванию значения) — см. приложение 1, раздел 4.2. При генерации таких записей полем «Комментарий» необходимо управлять осознанно.</w:t>
+        <w:t>Если настройка задана по группе пользователей, в типовой регистр записывается одна запись с этой группой. Разворачивание группы в записи по каждому пользователю не выполняется. Приоритет при вхождении пользователя в несколько групп определяется полем «Комментарий» записи типового регистра по каждой группе (по убыванию значения) — см. приложение 1, раздел 4.2. При генерации таких записей полем «Комментарий» необходимо управлять осознанно. Следствие для автоустановки: если у пользователя есть только детальные записи (касса, склад и т.п.), типовой поиск больше не смотрит «для всех» и группы. Задание после применения настроек копирует этому адресату полный набор родителя (выигрывающая группа или «для всех») — и пустую пару, и остальные комбинации. Свою пустую пару из регистра настроек, ручную общую дату и действующее открытие не подменяем; если своя общая дата уже есть, детали родителя не копируем. Согласованная заявка с детальной комбинацией копирует набор родителя сразу при открытии; досрочное закрытие снимает его сразу, если не осталось других детальных записей.</w:t>
       </w:r>
     </w:p>
     <w:p>
@@ -2872,7 +2998,7 @@
         <w:spacing w:after="120" w:line="276"/>
       </w:pPr>
       <w:r>
-        <w:t xml:space="preserve">При снятии признака «Включено» или удалении записи настройки регламентное задание при ближайшем успешном запуске удаляет соответствующие автоматические записи из типового регистра. Ручные записи не затрагиваются. Если настройку изменили так, что разворачивание даёт другой набор комбинаций (например, убрали организацию — вместо 18 записей по разделам остаётся общая дата адресата), устаревшие автозаписи удаляются, актуальные перезаписываются.</w:t>
+        <w:t>При снятии признака «Включено» или удалении записи настройки регламентное задание при ближайшем успешном запуске удаляет соответствующие автоматические записи из типового регистра, включая ранее скопированный набор родителя, если удалили единственную детальную настройку адресата. Ручные записи не затрагиваются. Если настройку изменили так, что разворачивание даёт другой набор комбинаций (например, убрали организацию — вместо 18 записей по разделам остаётся общая дата адресата), устаревшие автозаписи удаляются, актуальные перезаписываются.</w:t>
       </w:r>
     </w:p>
     <w:p>
@@ -2990,7 +3116,7 @@
         <w:spacing w:after="60" w:line="276"/>
       </w:pPr>
       <w:r>
-        <w:t xml:space="preserve">При наличии ошибок по итогам выполнения отправляется уведомление администраторам ИТ (список получателей — константа или регистр настроек уведомлений).</w:t>
+        <w:t>При наличии ошибок по итогам выполнения отправляется уведомление администраторам ИТ. Список получателей — константа нп_ПолучателиУведомленийСдвигаДатЗапрета и общая форма заполнения; полные права.</w:t>
       </w:r>
     </w:p>
     <w:p>
@@ -3043,7 +3169,7 @@
         <w:spacing w:after="120" w:line="276"/>
       </w:pPr>
       <w:r>
-        <w:t xml:space="preserve">Документ нп_ЗаявкаНаОткрытиеПериода.</w:t>
+        <w:t>Документ нп_ЗаявкаНаОткрытиеПериода. Организация — обязательный реквизит шапки (печать и согласование). Таблица разделов и объектов видна роли нп_УказаниеРазделовИОбъектовЗаявки и полноправному; без таблицы после согласования пишется общая дата адресата (пустые раздел и объект), не 18 организационных записей. «Пользователь (кому)» при создании сразу равен текущему пользователю, как ответственный; поле можно сменить. Пустой пользователь в заявке нельзя. На форме и в списке видно статус согласования ДО. Печатная форма «Заявка на открытие периода» без строки «Открывается»: состав уже в таблице.</w:t>
       </w:r>
     </w:p>
     <w:tbl>
@@ -3090,7 +3216,7 @@
                 <w:sz w:val="20"/>
                 <w:szCs w:val="20"/>
               </w:rPr>
-              <w:t xml:space="preserve">Реквизит</w:t>
+              <w:t>Реквизит</w:t>
             </w:r>
           </w:p>
         </w:tc>
@@ -3117,7 +3243,7 @@
                 <w:sz w:val="20"/>
                 <w:szCs w:val="20"/>
               </w:rPr>
-              <w:t xml:space="preserve">Вид</w:t>
+              <w:t>Вид</w:t>
             </w:r>
           </w:p>
         </w:tc>
@@ -3144,7 +3270,7 @@
                 <w:sz w:val="20"/>
                 <w:szCs w:val="20"/>
               </w:rPr>
-              <w:t xml:space="preserve">Описание</w:t>
+              <w:t>Описание</w:t>
             </w:r>
           </w:p>
         </w:tc>
@@ -3173,7 +3299,7 @@
                 <w:sz w:val="20"/>
                 <w:szCs w:val="20"/>
               </w:rPr>
-              <w:t xml:space="preserve">Объекты</w:t>
+              <w:t>Организация</w:t>
             </w:r>
           </w:p>
         </w:tc>
@@ -3197,7 +3323,7 @@
                 <w:sz w:val="20"/>
                 <w:szCs w:val="20"/>
               </w:rPr>
-              <w:t xml:space="preserve">Табличная часть</w:t>
+              <w:t>Реквизит</w:t>
             </w:r>
           </w:p>
         </w:tc>
@@ -3221,7 +3347,7 @@
                 <w:sz w:val="20"/>
                 <w:szCs w:val="20"/>
               </w:rPr>
-              <w:t xml:space="preserve">Перечень объектов, по которым открывается период: организации, кассы, склады, банковские счета, сценарии бюджетирования. Тип строки соответствует измерению «Объект» типового регистра. Незаполненная строка означает открытие общей даты по разделу.</w:t>
+              <w:t>Обязательная организация шапки (печать и согласование). Без таблицы разделов в типовой регистр не идёт: пишется общая дата адресата.</w:t>
             </w:r>
           </w:p>
         </w:tc>
@@ -3250,7 +3376,7 @@
                 <w:sz w:val="20"/>
                 <w:szCs w:val="20"/>
               </w:rPr>
-              <w:t xml:space="preserve">Период с</w:t>
+              <w:t>Объекты</w:t>
             </w:r>
           </w:p>
         </w:tc>
@@ -3274,7 +3400,7 @@
                 <w:sz w:val="20"/>
                 <w:szCs w:val="20"/>
               </w:rPr>
-              <w:t xml:space="preserve">Реквизит</w:t>
+              <w:t>Табличная часть</w:t>
             </w:r>
           </w:p>
         </w:tc>
@@ -3298,7 +3424,7 @@
                 <w:sz w:val="20"/>
                 <w:szCs w:val="20"/>
               </w:rPr>
-              <w:t xml:space="preserve">Дата, начиная с которой требуется открыть данные для редактирования. Единственный реквизит, определяющий отсечку (2.2.3). Дата окончания периода в документе не указывается — типовой механизм оперирует одной границей и открывает все данные после отсечки.</w:t>
+              <w:t>Строки «раздел + объект». Видна роли нп_УказаниеРазделовИОбъектовЗаявки и полноправному. Сначала раздел, затем объект своего типа. Пустая таблица — общая дата адресата.</w:t>
             </w:r>
           </w:p>
         </w:tc>
@@ -3327,7 +3453,7 @@
                 <w:sz w:val="20"/>
                 <w:szCs w:val="20"/>
               </w:rPr>
-              <w:t xml:space="preserve">СрокДействия (K)</w:t>
+              <w:t>Период с</w:t>
             </w:r>
           </w:p>
         </w:tc>
@@ -3351,7 +3477,7 @@
                 <w:sz w:val="20"/>
                 <w:szCs w:val="20"/>
               </w:rPr>
-              <w:t xml:space="preserve">Реквизит</w:t>
+              <w:t>Реквизит</w:t>
             </w:r>
           </w:p>
         </w:tc>
@@ -3375,7 +3501,7 @@
                 <w:sz w:val="20"/>
                 <w:szCs w:val="20"/>
               </w:rPr>
-              <w:t xml:space="preserve">Срок действия открытого периода в днях.</w:t>
+              <w:t>Дата, начиная с которой требуется открыть данные для редактирования. Единственный реквизит, определяющий отсечку (2.2.3). Дата окончания периода в документе не указывается — типовой механизм оперирует одной границей и открывает все данные после отсечки.</w:t>
             </w:r>
           </w:p>
         </w:tc>
@@ -3404,7 +3530,7 @@
                 <w:sz w:val="20"/>
                 <w:szCs w:val="20"/>
               </w:rPr>
-              <w:t xml:space="preserve">РазделДатыЗапрета</w:t>
+              <w:t>СрокДействия (K)</w:t>
             </w:r>
           </w:p>
         </w:tc>
@@ -3428,7 +3554,7 @@
                 <w:sz w:val="20"/>
                 <w:szCs w:val="20"/>
               </w:rPr>
-              <w:t xml:space="preserve">Реквизит</w:t>
+              <w:t>Реквизит</w:t>
             </w:r>
           </w:p>
         </w:tc>
@@ -3452,7 +3578,7 @@
                 <w:sz w:val="20"/>
                 <w:szCs w:val="20"/>
               </w:rPr>
-              <w:t xml:space="preserve">Необязательно. Сочетание с объектом трактуется по таблице 2.1.2. Раздел единый для всех строк табличной части.</w:t>
+              <w:t>Срок действия открытого периода в днях.</w:t>
             </w:r>
           </w:p>
         </w:tc>
@@ -3481,7 +3607,7 @@
                 <w:sz w:val="20"/>
                 <w:szCs w:val="20"/>
               </w:rPr>
-              <w:t xml:space="preserve">Пользователь</w:t>
+              <w:t>Пользователь</w:t>
             </w:r>
           </w:p>
         </w:tc>
@@ -3505,7 +3631,7 @@
                 <w:sz w:val="20"/>
                 <w:szCs w:val="20"/>
               </w:rPr>
-              <w:t xml:space="preserve">Реквизит</w:t>
+              <w:t>Реквизит</w:t>
             </w:r>
           </w:p>
         </w:tc>
@@ -3529,7 +3655,7 @@
                 <w:sz w:val="20"/>
                 <w:szCs w:val="20"/>
               </w:rPr>
-              <w:t xml:space="preserve">Пользователь или группа пользователей, для которых открывается период — соответствует измерению «Пользователь» типового регистра. Обязательное поле: заявка всегда открывает период для конкретного пользователя или группы, а не «для всех».</w:t>
+              <w:t>Пользователь или группа, для которых открывается период. Обязателен. При создании сразу = текущий пользователь, как ответственный; поле можно сменить. «Для всех» в заявке нельзя.</w:t>
             </w:r>
           </w:p>
         </w:tc>
@@ -3558,7 +3684,7 @@
                 <w:sz w:val="20"/>
                 <w:szCs w:val="20"/>
               </w:rPr>
-              <w:t xml:space="preserve">Причина открытия</w:t>
+              <w:t>Причина открытия</w:t>
             </w:r>
           </w:p>
         </w:tc>
@@ -3582,7 +3708,7 @@
                 <w:sz w:val="20"/>
                 <w:szCs w:val="20"/>
               </w:rPr>
-              <w:t xml:space="preserve">Реквизит</w:t>
+              <w:t>Реквизит</w:t>
             </w:r>
           </w:p>
         </w:tc>
@@ -3606,7 +3732,7 @@
                 <w:sz w:val="20"/>
                 <w:szCs w:val="20"/>
               </w:rPr>
-              <w:t xml:space="preserve">Обязательное текстовое обоснование для согласующих. В нём указывается, какие именно данные и за какой период требуется исправить.</w:t>
+              <w:t>Обязательное текстовое обоснование для согласующих. В нём указывается, какие именно данные и за какой период требуется исправить.</w:t>
             </w:r>
           </w:p>
         </w:tc>
@@ -3635,7 +3761,7 @@
                 <w:sz w:val="20"/>
                 <w:szCs w:val="20"/>
               </w:rPr>
-              <w:t xml:space="preserve">Ответственный</w:t>
+              <w:t>Ответственный</w:t>
             </w:r>
           </w:p>
         </w:tc>
@@ -3659,7 +3785,7 @@
                 <w:sz w:val="20"/>
                 <w:szCs w:val="20"/>
               </w:rPr>
-              <w:t xml:space="preserve">Реквизит</w:t>
+              <w:t>Реквизит</w:t>
             </w:r>
           </w:p>
         </w:tc>
@@ -3683,7 +3809,7 @@
                 <w:sz w:val="20"/>
                 <w:szCs w:val="20"/>
               </w:rPr>
-              <w:t xml:space="preserve">Пользователь, инициировавший заявку. Заполняется автоматически при создании, изменению не подлежит. Используется как реквизит согласования в 1С:Документообороте и при разборе ситуаций.</w:t>
+              <w:t>Пользователь, инициировавший заявку. Заполняется автоматически при создании, изменению не подлежит.</w:t>
             </w:r>
           </w:p>
         </w:tc>
@@ -3726,7 +3852,7 @@
         <w:spacing w:after="120" w:line="276"/>
       </w:pPr>
       <w:r>
-        <w:t xml:space="preserve">После перехода в состояние «Согласован» изменение документа запрещается штатными средствами интеграции. Это исключает сдвиг отсечки глубже согласованной и перезапуск процесса согласования по уже открытому периоду. Для изменения параметров открытый период закрывается досрочно (2.2.6) и создаётся новая заявка.</w:t>
+        <w:t>После появления связи с ДО (ещё до прогрузки статуса «На согласовании» в ERP) и в состояниях «На согласовании» / «Согласован» изменение документа запрещается: поля только просмотр, запись отклоняется. Это закрывает паузу обмена: нельзя править заявку, пока согласующие смотрят уже отправленные данные. После «Не согласован» заявку снова можно править и отправить повторно. Для изменения параметров согласованной заявки открытый период закрывается досрочно (2.2.6) и создаётся новая заявка. Команда «Закрыть период досрочно» доступна любому пользователю с правами на документ, пока есть действующее состояние.</w:t>
       </w:r>
     </w:p>
     <w:p>
@@ -3758,7 +3884,7 @@
         <w:spacing w:after="120" w:line="276"/>
       </w:pPr>
       <w:r>
-        <w:t xml:space="preserve">После перехода в состояние «Согласован» по каждой строке табличной части документа выполняется:</w:t>
+        <w:t>После перехода в состояние «Согласован» по комбинациям заявки выполняется:</w:t>
       </w:r>
     </w:p>
     <w:p>
@@ -3771,7 +3897,7 @@
         <w:spacing w:after="60" w:line="276"/>
       </w:pPr>
       <w:r>
-        <w:t xml:space="preserve">В типовой регистр записывается отсечка «Период с минус 1 день» (конец дня) — по объектам и разделу документа, для пользователя или группы, указанных в реквизите «Пользователь» документа.</w:t>
+        <w:t>В типовой регистр записывается отсечка «Период с минус 1 день» для пользователя или группы из реквизита «Пользователь». Без таблицы — общая дата адресата. Строка организационного раздела — этот раздел и организация шапки. Строка Банк / касса / склад / сценарий — выбранный объект или Объект = Раздел, если объект пуст.</w:t>
       </w:r>
     </w:p>
     <w:p>
@@ -3816,7 +3942,7 @@
         <w:spacing w:after="120" w:line="276"/>
       </w:pPr>
       <w:r>
-        <w:t xml:space="preserve">Для корректного возврата границы вводится регистр сведений нп_СостояниеОткрытыхПериодов (независимый, непериодический).</w:t>
+        <w:t>Для корректного возврата границы вводится регистр сведений нп_СостояниеОткрытыхПериодов (независимый, непериодический; в командном интерфейсе подсистемы, запись программная). Базовым правам — только чтение, без просмотра списка.</w:t>
       </w:r>
     </w:p>
     <w:tbl>
@@ -3918,7 +4044,7 @@
                 <w:sz w:val="20"/>
                 <w:szCs w:val="20"/>
               </w:rPr>
-              <w:t xml:space="preserve">Пользователь, ОбъектДатыЗапрета, РазделДатыЗапрета (измерения)</w:t>
+              <w:t>Пользователь, РазделДатыЗапрета, ОбъектДатыЗапрета (измерения)</w:t>
             </w:r>
           </w:p>
         </w:tc>
@@ -4367,7 +4493,7 @@
                 <w:sz w:val="20"/>
                 <w:szCs w:val="20"/>
               </w:rPr>
-              <w:t xml:space="preserve">Попытка изменить документ после согласования</w:t>
+              <w:t>Попытка изменить документ на согласовании или после согласования</w:t>
             </w:r>
           </w:p>
         </w:tc>
@@ -4391,7 +4517,7 @@
                 <w:sz w:val="20"/>
                 <w:szCs w:val="20"/>
               </w:rPr>
-              <w:t xml:space="preserve">Изменение запрещено (2.2.2). Для изменения параметров период закрывается досрочно и создаётся новая заявка.</w:t>
+              <w:t>Изменение запрещено (2.2.2). На согласовании дождитесь решения или отзовите обработку в ДО; для согласованной заявки период закрывается досрочно и создаётся новая заявка. После «Не согласован» правку снова можно.</w:t>
             </w:r>
           </w:p>
         </w:tc>
@@ -4444,7 +4570,7 @@
                 <w:sz w:val="20"/>
                 <w:szCs w:val="20"/>
               </w:rPr>
-              <w:t xml:space="preserve">Обращение в ИТ от ответственного по заявке. Пользователь с полными правами выполняет команду «Закрыть период досрочно» в форме документа. Результат — как при истечении срока K. Прямое исправление типового регистра вручную не допускается: запись регистра состояния останется действующей и заблокирует автоматическую установку.</w:t>
+              <w:t>Любой пользователь с правами на документ выполняет команду «Закрыть период досрочно» в форме документа. Результат — как при истечении срока K. Прямое исправление типового регистра вручную не допускается: запись регистра состояния останется действующей и заблокирует автоматическую установку.</w:t>
             </w:r>
           </w:p>
         </w:tc>
@@ -4691,7 +4817,7 @@
         <w:spacing w:after="120" w:line="276"/>
       </w:pPr>
       <w:r>
-        <w:t xml:space="preserve">Дополнительно выводится примечание о том, что фактический возврат границы происходит при ближайшем ночном запуске регламентного задания.</w:t>
+        <w:t>В пояснении на форме время регламентного задания не указывается. Фактический возврат границы — ночным заданием на следующий день после последнего дня K (или командой «Закрыть период досрочно»).</w:t>
       </w:r>
     </w:p>
     <w:p>
@@ -4762,7 +4888,7 @@
         <w:spacing w:after="120" w:line="276"/>
       </w:pPr>
       <w:r>
-        <w:t xml:space="preserve">Для записей, возникших из временно открытого периода, дополнительно выводится ответственный по заявке. Отбор по объекту, разделу и пользователю. Отчёт необходим для разбора спорных ситуаций и для контроля ручных записей, перекрывающих автоматическую установку (2.1.4).</w:t>
+        <w:t>Для записей временно открытого периода дополнительно выводится ответственный по заявке (первая заявка из регистра состояния; вторая пересекающаяся заявка отдельной строкой не показывается). Колонка описания даты запрета — читаемый текст, как на типовой форме БСП. Отбор по объекту, разделу и пользователю. Отчёт — только полные права, в базовую роль не входит. Нужен для разбора спорных ситуаций и контроля ручных записей, которые задание намеренно не трогает (2.1.4).</w:t>
       </w:r>
     </w:p>
     <w:p>
@@ -4977,7 +5103,7 @@
         <w:spacing w:after="60" w:line="276"/>
       </w:pPr>
       <w:r>
-        <w:t xml:space="preserve">Регистр сведений нп_СостояниеОткрытыхПериодов (служебный, без интерактивного редактирования).</w:t>
+        <w:t>Регистр сведений нп_СостояниеОткрытыхПериодов (в командном интерфейсе; записывает задание и обработчик согласования).</w:t>
       </w:r>
     </w:p>
     <w:p>
@@ -5029,7 +5155,7 @@
         <w:spacing w:after="60" w:line="276"/>
       </w:pPr>
       <w:r>
-        <w:t xml:space="preserve">Отчёт нп_ДействующиеДатыЗапрета.</w:t>
+        <w:t>Отчёт нп_ДействующиеДатыЗапрета — только полные права.</w:t>
       </w:r>
     </w:p>
     <w:p>
@@ -5042,7 +5168,7 @@
         <w:spacing w:after="60" w:line="276"/>
       </w:pPr>
       <w:r>
-        <w:t xml:space="preserve">Роль нп_БазовыеПрава дополняется правами на новые объекты расширения; новые роли не создаются.</w:t>
+        <w:t>Роль нп_БазовыеПраваДатЗапрета: заявка, досрочное закрытие и чтение регистра состояния без просмотра списка; без отчёта, настроек и константы. Роль-маркер нп_УказаниеРазделовИОбъектовЗаявки: таблица разделов и объектов на форме заявки (полноправному видна и без неё).</w:t>
       </w:r>
     </w:p>
     <w:p>
@@ -5127,7 +5253,7 @@
         <w:spacing w:after="120" w:line="276"/>
       </w:pPr>
       <w:r>
-        <w:t xml:space="preserve">Пользователь создаёт документ нп_ЗаявкаНаОткрытиеПериода, указывает пользователя или группу, для которых открывается период, и отправляет документ на согласование в 1С:Документооборот. После согласования период открывается автоматически, по истечении срока — закрывается. Изменить согласованный документ нельзя; если параметры оказались неверны или период больше не нужен, следует обратиться в ИТ для досрочного закрытия и создать новую заявку.</w:t>
+        <w:t>Пользователь с нп_БазовыеПраваДатЗапрета создаёт документ нп_ЗаявкаНаОткрытиеПериода, указывает пользователя или группу, для которых открывается период, и отправляет документ на согласование в 1С:Документооборот. После согласования период открывается автоматически, по истечении срока — закрывается. Изменить согласованный документ нельзя; если параметры оказались неверны или период больше не нужен, выполняется команда «Закрыть период досрочно» и создаётся новая заявка.</w:t>
       </w:r>
     </w:p>
     <w:p>
@@ -5135,7 +5261,7 @@
         <w:spacing w:after="120" w:line="276"/>
       </w:pPr>
       <w:r>
-        <w:t xml:space="preserve">Текущее состояние границ и источник каждой записи проверяются отчётом нп_ДействующиеДатыЗапрета.</w:t>
+        <w:t>Текущее состояние границ и источник каждой записи проверяются отчётом нп_ДействующиеДатыЗапрета (полные права).</w:t>
       </w:r>
     </w:p>
     <w:p>
@@ -5345,7 +5471,7 @@
                 <w:sz w:val="20"/>
                 <w:szCs w:val="20"/>
               </w:rPr>
-              <w:t xml:space="preserve">В типовом регистре по всем разделам, допускающим объект «организация», дата 15.08.2026 23:59:59, пользователь не заполнен</w:t>
+              <w:t>В типовом регистре 18 организационных разделов, включая УчетПоМСФО; пользователь = для всех пользователей; дата 15.08.2026 23:59:59. Пустой пары раздел+объект нет.</w:t>
             </w:r>
           </w:p>
         </w:tc>
@@ -5783,7 +5909,7 @@
                 <w:sz w:val="20"/>
                 <w:szCs w:val="20"/>
               </w:rPr>
-              <w:t xml:space="preserve">Настройка: объект — конкретная касса, раздел не задан, N=3</w:t>
+              <w:t>Настройка: объект — конкретная касса, раздел «Касса», N=3</w:t>
             </w:r>
           </w:p>
         </w:tc>
@@ -5807,7 +5933,7 @@
                 <w:sz w:val="20"/>
                 <w:szCs w:val="20"/>
               </w:rPr>
-              <w:t xml:space="preserve">Настройка развёрнута в записи по всем разделам, допускающим тип объекта «касса»; при записи документа по этой кассе в разделе с объектом «касса» действует граница N=3</w:t>
+              <w:t>Одна запись типового регистра: раздел Касса и эта касса; при записи документа по этой кассе действует граница N=3</w:t>
             </w:r>
           </w:p>
         </w:tc>
@@ -6014,7 +6140,7 @@
                 <w:sz w:val="20"/>
                 <w:szCs w:val="20"/>
               </w:rPr>
-              <w:t xml:space="preserve">Попытка записать настройку с незаполненными объектом и разделом</w:t>
+              <w:t>Настройка с незаполненными объектом и разделом, пользователь пуст, N=5</w:t>
             </w:r>
           </w:p>
         </w:tc>
@@ -6038,7 +6164,7 @@
                 <w:sz w:val="20"/>
                 <w:szCs w:val="20"/>
               </w:rPr>
-              <w:t xml:space="preserve">Запись отклонена с пояснением</w:t>
+              <w:t>Запись допускается: общая дата адресата «для всех пользователей», пустые раздел и объект, дата 15.08.2026 23:59:59</w:t>
             </w:r>
           </w:p>
         </w:tc>
@@ -6577,7 +6703,7 @@
                 <w:sz w:val="20"/>
                 <w:szCs w:val="20"/>
               </w:rPr>
-              <w:t xml:space="preserve">Открытие для всех пользователей; по истечении срока граница возвращена к прежнему значению</w:t>
+              <w:t>Отсечка записана для пользователя, указанного в документе (не «для всех»); по истечении срока граница возвращена к прежнему значению (или запись типового регистра удалена, если прежнего значения не было)</w:t>
             </w:r>
           </w:p>
         </w:tc>
@@ -6808,7 +6934,7 @@
                 <w:sz w:val="20"/>
                 <w:szCs w:val="20"/>
               </w:rPr>
-              <w:t xml:space="preserve">Прежнее значение возвращено немедленно, запись регистра состояния удалена, дальнейшие запуски задания применяют настройки автоматической установки</w:t>
+              <w:t>Команду выполняет любой пользователь с правами на документ. Прежнее значение возвращено немедленно, запись регистра состояния удалена, дальнейшие запуски задания применяют настройки автоматической установки</w:t>
             </w:r>
           </w:p>
         </w:tc>
@@ -7015,7 +7141,7 @@
                 <w:sz w:val="20"/>
                 <w:szCs w:val="20"/>
               </w:rPr>
-              <w:t xml:space="preserve">Пользователь с ролью нп_БазовыеПрава открывает регистр настроек</w:t>
+              <w:t>Пользователь с ролью нп_БазовыеПраваДатЗапрета без полных прав открывает регистр настроек, форму константы и отчёт</w:t>
             </w:r>
           </w:p>
         </w:tc>
@@ -7039,7 +7165,7 @@
                 <w:sz w:val="20"/>
                 <w:szCs w:val="20"/>
               </w:rPr>
-              <w:t xml:space="preserve">Регистр недоступен полностью, включая просмотр</w:t>
+              <w:t>Настройки, константа и отчёт недоступны, включая просмотр. Заявку создать и заполнить можно; «Закрыть период досрочно» видно и доступно при действующем состоянии</w:t>
             </w:r>
           </w:p>
         </w:tc>

</xml_diff>

<commit_message>
Sync the ERP.2026.14 appendix with current search rules.
Add appendix 1 and B as a Word file next to the request: typical BSP lookup, empty-pair rules, 18 organization sections, and the two-stage search. Keep a text extract and a test so the cited sections stay aligned.

Co-authored-by: an_skripko <an_skripko@vk.com>
</commit_message>
<xml_diff>
--- a/ERP.2026.14 Заявка на доработку 1С ERP УХ (ред. 2)_1.docx
+++ b/ERP.2026.14 Заявка на доработку 1С ERP УХ (ред. 2)_1.docx
@@ -2974,7 +2974,7 @@
         <w:spacing w:after="120" w:line="276"/>
       </w:pPr>
       <w:r>
-        <w:t>Если настройка задана по группе пользователей, в типовой регистр записывается одна запись с этой группой. Разворачивание группы в записи по каждому пользователю не выполняется. Приоритет при вхождении пользователя в несколько групп определяется полем «Комментарий» записи типового регистра по каждой группе (по убыванию значения) — см. приложение 1, раздел 4.2. При генерации таких записей полем «Комментарий» необходимо управлять осознанно. Следствие для автоустановки: если у пользователя есть только детальные записи (касса, склад и т.п.), типовой поиск больше не смотрит «для всех» и группы. Задание после применения настроек копирует этому адресату полный набор родителя (выигрывающая группа или «для всех») — и пустую пару, и остальные комбинации. Свою пустую пару из регистра настроек, ручную общую дату и действующее открытие не подменяем; если своя общая дата уже есть, детали родителя не копируем. Согласованная заявка с детальной комбинацией копирует набор родителя сразу при открытии; досрочное закрытие снимает его сразу, если не осталось других детальных записей.</w:t>
+        <w:t>Если настройка задана по группе пользователей, в типовой регистр записывается одна запись с этой группой. Разворачивание группы в записи по каждому пользователю не выполняется. Приоритет при вхождении пользователя в несколько групп определяется полем «Комментарий» записи типового регистра по каждой группе (по убыванию значения) — см. приложение 1, раздел 4.2. При генерации таких записей полем «Комментарий» необходимо управлять осознанно. Следствие для автоустановки: если у пользователя есть только детальные записи (касса, склад и т.п.), типовой поиск больше не смотрит «для всех» и группы. Задание после применения настроек копирует этому адресату полный набор родителя (выигрывающая группа или «для всех») — и пустую пару, и остальные комбинации. Свою пустую пару из регистра настроек, ручную общую дату и действующее открытие не подменяем; если своя общая дата уже есть, детали родителя не копируем. Согласованная заявка с детальной комбинацией копирует набор родителя сразу при открытии; досрочное закрытие снимает его сразу, если не осталось других детальных записей. Следствие для автоустановки: если у пользователя есть только детальные записи (касса, склад и т.п.), типовой поиск больше не смотрит «для всех» и группы. Задание после применения настроек копирует этому адресату полный набор родителя (выигрывающая группа или «для всех») — и пустую пару, и остальные комбинации. Свою пустую пару из регистра настроек, ручную общую дату и действующее открытие не подменяем; если своя общая дата уже есть, детали родителя не копируем. Согласованная заявка с детальной комбинацией копирует набор родителя сразу при открытии; досрочное закрытие снимает его сразу, если не осталось других детальных записей.</w:t>
       </w:r>
     </w:p>
     <w:p>
@@ -7841,6 +7841,16 @@
       </w:pPr>
       <w:r>
         <w:t xml:space="preserve"/>
+      </w:r>
+    </w:p>
+    <w:p>
+      <w:r>
+        <w:t>Приложение 1 и приложение Б</w:t>
+      </w:r>
+    </w:p>
+    <w:p>
+      <w:r>
+        <w:t>Порядок типового поиска даты запрета (адресат, раздел, объект, общая дата, приоритет групп) — в файле «ERP.2026.14 Приложение 1 — порядок поиска даты запрета.docx». Номера разделов 3.3, 4.1, 4.2 и 7 в тексте заявки относятся к этому приложению. Приложение Б в том же файле: два независимых этапа поиска.</w:t>
       </w:r>
     </w:p>
     <w:sectPr>

</xml_diff>